<commit_message>
Ajuste nombres de archivos
</commit_message>
<xml_diff>
--- a/Informe Algoritmos de clasificación.docx
+++ b/Informe Algoritmos de clasificación.docx
@@ -128,6 +128,94 @@
     </w:p>
     <w:p>
       <w:pPr>
+        <w:spacing w:after="0" w:line="240" w:lineRule="auto"/>
+        <w:rPr>
+          <w:rFonts w:ascii="Arial" w:hAnsi="Arial" w:cs="Arial"/>
+          <w:sz w:val="21"/>
+          <w:szCs w:val="21"/>
+        </w:rPr>
+      </w:pPr>
+      <w:r>
+        <w:rPr>
+          <w:rFonts w:ascii="Arial" w:eastAsia="Times New Roman" w:hAnsi="Arial" w:cs="Arial"/>
+          <w:b/>
+          <w:bCs/>
+          <w:kern w:val="0"/>
+          <w:sz w:val="21"/>
+          <w:szCs w:val="21"/>
+          <w:lang w:eastAsia="es-MX"/>
+          <w14:ligatures w14:val="none"/>
+        </w:rPr>
+        <w:t xml:space="preserve">Enlace al repositorio en </w:t>
+      </w:r>
+      <w:proofErr w:type="spellStart"/>
+      <w:r>
+        <w:rPr>
+          <w:rFonts w:ascii="Arial" w:eastAsia="Times New Roman" w:hAnsi="Arial" w:cs="Arial"/>
+          <w:b/>
+          <w:bCs/>
+          <w:kern w:val="0"/>
+          <w:sz w:val="21"/>
+          <w:szCs w:val="21"/>
+          <w:lang w:eastAsia="es-MX"/>
+          <w14:ligatures w14:val="none"/>
+        </w:rPr>
+        <w:t>Github</w:t>
+      </w:r>
+      <w:proofErr w:type="spellEnd"/>
+      <w:r>
+        <w:rPr>
+          <w:rFonts w:ascii="Arial" w:eastAsia="Times New Roman" w:hAnsi="Arial" w:cs="Arial"/>
+          <w:b/>
+          <w:bCs/>
+          <w:kern w:val="0"/>
+          <w:sz w:val="21"/>
+          <w:szCs w:val="21"/>
+          <w:lang w:eastAsia="es-MX"/>
+          <w14:ligatures w14:val="none"/>
+        </w:rPr>
+        <w:t>:</w:t>
+      </w:r>
+      <w:r>
+        <w:rPr>
+          <w:rFonts w:ascii="Arial" w:eastAsia="Times New Roman" w:hAnsi="Arial" w:cs="Arial"/>
+          <w:b/>
+          <w:bCs/>
+          <w:kern w:val="0"/>
+          <w:sz w:val="21"/>
+          <w:szCs w:val="21"/>
+          <w:lang w:eastAsia="es-MX"/>
+          <w14:ligatures w14:val="none"/>
+        </w:rPr>
+        <w:t xml:space="preserve"> </w:t>
+      </w:r>
+      <w:hyperlink r:id="rId5" w:history="1">
+        <w:r>
+          <w:rPr>
+            <w:rStyle w:val="Hipervnculo"/>
+            <w:rFonts w:ascii="Arial" w:hAnsi="Arial" w:cs="Arial"/>
+            <w:sz w:val="21"/>
+            <w:szCs w:val="21"/>
+          </w:rPr>
+          <w:t>https://github.com/davatorresrivas/algoritmos_clasificacion.git</w:t>
+        </w:r>
+      </w:hyperlink>
+    </w:p>
+    <w:p>
+      <w:pPr>
+        <w:spacing w:after="0" w:line="240" w:lineRule="auto"/>
+        <w:rPr>
+          <w:rFonts w:ascii="Arial" w:eastAsia="Times New Roman" w:hAnsi="Arial" w:cs="Arial"/>
+          <w:kern w:val="0"/>
+          <w:sz w:val="21"/>
+          <w:szCs w:val="21"/>
+          <w:lang w:eastAsia="es-MX"/>
+          <w14:ligatures w14:val="none"/>
+        </w:rPr>
+      </w:pPr>
+    </w:p>
+    <w:p>
+      <w:pPr>
         <w:spacing w:after="100" w:afterAutospacing="1" w:line="240" w:lineRule="auto"/>
         <w:jc w:val="center"/>
         <w:outlineLvl w:val="0"/>
@@ -886,6 +974,7 @@
           <w:lang w:eastAsia="es-MX"/>
           <w14:ligatures w14:val="none"/>
         </w:rPr>
+        <w:lastRenderedPageBreak/>
         <w:t>División de Datos:</w:t>
       </w:r>
       <w:r>
@@ -2373,6 +2462,7 @@
           <w:lang w:eastAsia="es-MX"/>
           <w14:ligatures w14:val="none"/>
         </w:rPr>
+        <w:lastRenderedPageBreak/>
         <w:t>Porque SVM busca maximizar el margen de separación entre hiperplanos mediante cálculo de distancias. Si una variable tiene rangos numéricos muy superiores a otra, sesgará la optimización del modelo.</w:t>
       </w:r>
     </w:p>
@@ -2404,7 +2494,6 @@
           <w:lang w:eastAsia="es-MX"/>
           <w14:ligatures w14:val="none"/>
         </w:rPr>
-        <w:lastRenderedPageBreak/>
         <w:t>¿Qué resultado obtiene SVM frente a los modelos basados en árboles?</w:t>
       </w:r>
     </w:p>
@@ -3289,7 +3378,7 @@
                     <pic:cNvPicPr/>
                   </pic:nvPicPr>
                   <pic:blipFill>
-                    <a:blip r:embed="rId5">
+                    <a:blip r:embed="rId6">
                       <a:extLst>
                         <a:ext uri="{28A0092B-C50C-407E-A947-70E740481C1C}">
                           <a14:useLocalDpi xmlns:a14="http://schemas.microsoft.com/office/drawing/2010/main" val="0"/>
@@ -3413,7 +3502,6 @@
           <w:lang w:eastAsia="es-MX"/>
           <w14:ligatures w14:val="none"/>
         </w:rPr>
-        <w:lastRenderedPageBreak/>
         <w:drawing>
           <wp:inline distT="0" distB="0" distL="0" distR="0" wp14:anchorId="1EF323EB" wp14:editId="70B5ABA9">
             <wp:extent cx="4445000" cy="2235200"/>
@@ -3430,7 +3518,7 @@
                     <pic:cNvPicPr/>
                   </pic:nvPicPr>
                   <pic:blipFill>
-                    <a:blip r:embed="rId6"/>
+                    <a:blip r:embed="rId7"/>
                     <a:stretch>
                       <a:fillRect/>
                     </a:stretch>
@@ -4302,6 +4390,7 @@
           <w:lang w:eastAsia="es-MX"/>
           <w14:ligatures w14:val="none"/>
         </w:rPr>
+        <w:lastRenderedPageBreak/>
         <w:t xml:space="preserve">El </w:t>
       </w:r>
       <w:r>
@@ -4383,7 +4472,6 @@
           <w:lang w:eastAsia="es-MX"/>
           <w14:ligatures w14:val="none"/>
         </w:rPr>
-        <w:lastRenderedPageBreak/>
         <w:t xml:space="preserve">Los algoritmos basados en distancias (K-NN) u optimización espacial (SVM) se habrían distorsionado sin el escalamiento debido a las diferentes escalas de las 30 variables. Los árboles y </w:t>
       </w:r>
       <w:proofErr w:type="spellStart"/>
@@ -5199,7 +5287,7 @@
           <w:szCs w:val="21"/>
         </w:rPr>
       </w:pPr>
-      <w:hyperlink r:id="rId7" w:history="1">
+      <w:hyperlink r:id="rId8" w:history="1">
         <w:r>
           <w:rPr>
             <w:rStyle w:val="Hipervnculo"/>

</xml_diff>